<commit_message>
feat(dvor1150a): apply detailed configuration with scoped recovery evidence
Wire native transmitter and monitor configuration into readings, digital keyer observations and protection. Add exact scenario targets, legacy DTO compatibility and real PostgreSQL persistence regression. Reset runtime keyer state at run boundaries and disclose stored-only capabilities.
</commit_message>
<xml_diff>
--- a/public/templates/ai-scenario-dvor-1150a.docx
+++ b/public/templates/ai-scenario-dvor-1150a.docx
@@ -557,6 +557,167 @@
         <w:tc>
           <w:p>
             <w:r>
+              <w:t>Keyer Input Level · Chọn: Active High/Open; Active Low/Closed</w:t>
+            </w:r>
+          </w:p>
+        </w:tc>
+        <w:tc>
+          <w:p>
+            <w:r>
+              <w:t>Active Low/Closed</w:t>
+            </w:r>
+          </w:p>
+        </w:tc>
+        <w:tc>
+          <w:p>
+            <w:r>
+              <w:t>Giá trị: ______; Nguồn/trang: ______</w:t>
+            </w:r>
+          </w:p>
+        </w:tc>
+      </w:tr>
+      <w:tr>
+        <w:tc>
+          <w:p>
+            <w:r>
+              <w:t>External Keying output · Chọn: Disabled; Enabled; Windowed</w:t>
+            </w:r>
+          </w:p>
+        </w:tc>
+        <w:tc>
+          <w:p>
+            <w:r>
+              <w:t>Disabled</w:t>
+            </w:r>
+          </w:p>
+        </w:tc>
+        <w:tc>
+          <w:p>
+            <w:r>
+              <w:t>Giá trị: ______; Nguồn/trang: ______</w:t>
+            </w:r>
+          </w:p>
+        </w:tc>
+      </w:tr>
+      <w:tr>
+        <w:tc>
+          <w:p>
+            <w:r>
+              <w:t>windowedKeyingInput · Bật / Tắt</w:t>
+            </w:r>
+          </w:p>
+        </w:tc>
+        <w:tc>
+          <w:p>
+            <w:r>
+              <w:t>Tắt</w:t>
+            </w:r>
+          </w:p>
+        </w:tc>
+        <w:tc>
+          <w:p>
+            <w:r>
+              <w:t>Giá trị: ______; Nguồn/trang: ______</w:t>
+            </w:r>
+          </w:p>
+        </w:tc>
+      </w:tr>
+      <w:tr>
+        <w:tc>
+          <w:p>
+            <w:r>
+              <w:t>selfKeyOnLoss · Bật / Tắt</w:t>
+            </w:r>
+          </w:p>
+        </w:tc>
+        <w:tc>
+          <w:p>
+            <w:r>
+              <w:t>Tắt</w:t>
+            </w:r>
+          </w:p>
+        </w:tc>
+        <w:tc>
+          <w:p>
+            <w:r>
+              <w:t>Giá trị: ______; Nguồn/trang: ______</w:t>
+            </w:r>
+          </w:p>
+        </w:tc>
+      </w:tr>
+      <w:tr>
+        <w:tc>
+          <w:p>
+            <w:r>
+              <w:t>shutdownOnLoss · Bật / Tắt</w:t>
+            </w:r>
+          </w:p>
+        </w:tc>
+        <w:tc>
+          <w:p>
+            <w:r>
+              <w:t>Tắt</w:t>
+            </w:r>
+          </w:p>
+        </w:tc>
+        <w:tc>
+          <w:p>
+            <w:r>
+              <w:t>Giá trị: ______; Nguồn/trang: ______</w:t>
+            </w:r>
+          </w:p>
+        </w:tc>
+      </w:tr>
+      <w:tr>
+        <w:tc>
+          <w:p>
+            <w:r>
+              <w:t>restartWhenResumed · Bật / Tắt</w:t>
+            </w:r>
+          </w:p>
+        </w:tc>
+        <w:tc>
+          <w:p>
+            <w:r>
+              <w:t>Tắt</w:t>
+            </w:r>
+          </w:p>
+        </w:tc>
+        <w:tc>
+          <w:p>
+            <w:r>
+              <w:t>Giá trị: ______; Nguồn/trang: ______</w:t>
+            </w:r>
+          </w:p>
+        </w:tc>
+      </w:tr>
+      <w:tr>
+        <w:tc>
+          <w:p>
+            <w:r>
+              <w:t>suppressOnShutdown · Bật / Tắt</w:t>
+            </w:r>
+          </w:p>
+        </w:tc>
+        <w:tc>
+          <w:p>
+            <w:r>
+              <w:t>Tắt</w:t>
+            </w:r>
+          </w:p>
+        </w:tc>
+        <w:tc>
+          <w:p>
+            <w:r>
+              <w:t>Giá trị: ______; Nguồn/trang: ______</w:t>
+            </w:r>
+          </w:p>
+        </w:tc>
+      </w:tr>
+      <w:tr>
+        <w:tc>
+          <w:p>
+            <w:r>
               <w:t>Azimuth angle offset · Đơn vị: ° · ≥ -360 · ≤ 360</w:t>
             </w:r>
           </w:p>
@@ -1335,6 +1496,167 @@
         <w:tc>
           <w:p>
             <w:r>
+              <w:t>Keyer Input Level · Chọn: Active High/Open; Active Low/Closed</w:t>
+            </w:r>
+          </w:p>
+        </w:tc>
+        <w:tc>
+          <w:p>
+            <w:r>
+              <w:t>Active Low/Closed</w:t>
+            </w:r>
+          </w:p>
+        </w:tc>
+        <w:tc>
+          <w:p>
+            <w:r>
+              <w:t>Giá trị: ______; Nguồn/trang: ______</w:t>
+            </w:r>
+          </w:p>
+        </w:tc>
+      </w:tr>
+      <w:tr>
+        <w:tc>
+          <w:p>
+            <w:r>
+              <w:t>External Keying output · Chọn: Disabled; Enabled; Windowed</w:t>
+            </w:r>
+          </w:p>
+        </w:tc>
+        <w:tc>
+          <w:p>
+            <w:r>
+              <w:t>Disabled</w:t>
+            </w:r>
+          </w:p>
+        </w:tc>
+        <w:tc>
+          <w:p>
+            <w:r>
+              <w:t>Giá trị: ______; Nguồn/trang: ______</w:t>
+            </w:r>
+          </w:p>
+        </w:tc>
+      </w:tr>
+      <w:tr>
+        <w:tc>
+          <w:p>
+            <w:r>
+              <w:t>windowedKeyingInput · Bật / Tắt</w:t>
+            </w:r>
+          </w:p>
+        </w:tc>
+        <w:tc>
+          <w:p>
+            <w:r>
+              <w:t>Tắt</w:t>
+            </w:r>
+          </w:p>
+        </w:tc>
+        <w:tc>
+          <w:p>
+            <w:r>
+              <w:t>Giá trị: ______; Nguồn/trang: ______</w:t>
+            </w:r>
+          </w:p>
+        </w:tc>
+      </w:tr>
+      <w:tr>
+        <w:tc>
+          <w:p>
+            <w:r>
+              <w:t>selfKeyOnLoss · Bật / Tắt</w:t>
+            </w:r>
+          </w:p>
+        </w:tc>
+        <w:tc>
+          <w:p>
+            <w:r>
+              <w:t>Tắt</w:t>
+            </w:r>
+          </w:p>
+        </w:tc>
+        <w:tc>
+          <w:p>
+            <w:r>
+              <w:t>Giá trị: ______; Nguồn/trang: ______</w:t>
+            </w:r>
+          </w:p>
+        </w:tc>
+      </w:tr>
+      <w:tr>
+        <w:tc>
+          <w:p>
+            <w:r>
+              <w:t>shutdownOnLoss · Bật / Tắt</w:t>
+            </w:r>
+          </w:p>
+        </w:tc>
+        <w:tc>
+          <w:p>
+            <w:r>
+              <w:t>Tắt</w:t>
+            </w:r>
+          </w:p>
+        </w:tc>
+        <w:tc>
+          <w:p>
+            <w:r>
+              <w:t>Giá trị: ______; Nguồn/trang: ______</w:t>
+            </w:r>
+          </w:p>
+        </w:tc>
+      </w:tr>
+      <w:tr>
+        <w:tc>
+          <w:p>
+            <w:r>
+              <w:t>restartWhenResumed · Bật / Tắt</w:t>
+            </w:r>
+          </w:p>
+        </w:tc>
+        <w:tc>
+          <w:p>
+            <w:r>
+              <w:t>Tắt</w:t>
+            </w:r>
+          </w:p>
+        </w:tc>
+        <w:tc>
+          <w:p>
+            <w:r>
+              <w:t>Giá trị: ______; Nguồn/trang: ______</w:t>
+            </w:r>
+          </w:p>
+        </w:tc>
+      </w:tr>
+      <w:tr>
+        <w:tc>
+          <w:p>
+            <w:r>
+              <w:t>suppressOnShutdown · Bật / Tắt</w:t>
+            </w:r>
+          </w:p>
+        </w:tc>
+        <w:tc>
+          <w:p>
+            <w:r>
+              <w:t>Tắt</w:t>
+            </w:r>
+          </w:p>
+        </w:tc>
+        <w:tc>
+          <w:p>
+            <w:r>
+              <w:t>Giá trị: ______; Nguồn/trang: ______</w:t>
+            </w:r>
+          </w:p>
+        </w:tc>
+      </w:tr>
+      <w:tr>
+        <w:tc>
+          <w:p>
+            <w:r>
               <w:t>Azimuth angle offset · Đơn vị: ° · ≥ -360 · ≤ 360</w:t>
             </w:r>
           </w:p>
@@ -3048,6 +3370,190 @@
           </w:p>
         </w:tc>
       </w:tr>
+      <w:tr>
+        <w:tc>
+          <w:p>
+            <w:r>
+              <w:t>Test Generator Azimuth Angle · Đơn vị: ° · ≥ 0 · ≤ 360</w:t>
+            </w:r>
+          </w:p>
+        </w:tc>
+        <w:tc>
+          <w:p>
+            <w:r>
+              <w:t>0</w:t>
+            </w:r>
+          </w:p>
+        </w:tc>
+        <w:tc>
+          <w:p>
+            <w:r>
+              <w:t>Giá trị: ______; Nguồn/trang: ______</w:t>
+            </w:r>
+          </w:p>
+        </w:tc>
+      </w:tr>
+      <w:tr>
+        <w:tc>
+          <w:p>
+            <w:r>
+              <w:t>Test Generator 30 Hz Modulation · Đơn vị: % · ≥ 0 · ≤ 100</w:t>
+            </w:r>
+          </w:p>
+        </w:tc>
+        <w:tc>
+          <w:p>
+            <w:r>
+              <w:t>30</w:t>
+            </w:r>
+          </w:p>
+        </w:tc>
+        <w:tc>
+          <w:p>
+            <w:r>
+              <w:t>Giá trị: ______; Nguồn/trang: ______</w:t>
+            </w:r>
+          </w:p>
+        </w:tc>
+      </w:tr>
+      <w:tr>
+        <w:tc>
+          <w:p>
+            <w:r>
+              <w:t>Test Generator 9960 Hz Modulation · Đơn vị: % · ≥ 0 · ≤ 100</w:t>
+            </w:r>
+          </w:p>
+        </w:tc>
+        <w:tc>
+          <w:p>
+            <w:r>
+              <w:t>30</w:t>
+            </w:r>
+          </w:p>
+        </w:tc>
+        <w:tc>
+          <w:p>
+            <w:r>
+              <w:t>Giá trị: ______; Nguồn/trang: ______</w:t>
+            </w:r>
+          </w:p>
+        </w:tc>
+      </w:tr>
+      <w:tr>
+        <w:tc>
+          <w:p>
+            <w:r>
+              <w:t>Test Generator Deviation · Đơn vị: Ratio · ≥ 0 · ≤ 100</w:t>
+            </w:r>
+          </w:p>
+        </w:tc>
+        <w:tc>
+          <w:p>
+            <w:r>
+              <w:t>16</w:t>
+            </w:r>
+          </w:p>
+        </w:tc>
+        <w:tc>
+          <w:p>
+            <w:r>
+              <w:t>Giá trị: ______; Nguồn/trang: ______</w:t>
+            </w:r>
+          </w:p>
+        </w:tc>
+      </w:tr>
+      <w:tr>
+        <w:tc>
+          <w:p>
+            <w:r>
+              <w:t>Test Generator Ident Modulation · Đơn vị: % · ≥ 0 · ≤ 100</w:t>
+            </w:r>
+          </w:p>
+        </w:tc>
+        <w:tc>
+          <w:p>
+            <w:r>
+              <w:t>10</w:t>
+            </w:r>
+          </w:p>
+        </w:tc>
+        <w:tc>
+          <w:p>
+            <w:r>
+              <w:t>Giá trị: ______; Nguồn/trang: ______</w:t>
+            </w:r>
+          </w:p>
+        </w:tc>
+      </w:tr>
+      <w:tr>
+        <w:tc>
+          <w:p>
+            <w:r>
+              <w:t>Test Generator Audio Modulation · Đơn vị: % · ≥ 0 · ≤ 100</w:t>
+            </w:r>
+          </w:p>
+        </w:tc>
+        <w:tc>
+          <w:p>
+            <w:r>
+              <w:t>10</w:t>
+            </w:r>
+          </w:p>
+        </w:tc>
+        <w:tc>
+          <w:p>
+            <w:r>
+              <w:t>Giá trị: ______; Nguồn/trang: ______</w:t>
+            </w:r>
+          </w:p>
+        </w:tc>
+      </w:tr>
+      <w:tr>
+        <w:tc>
+          <w:p>
+            <w:r>
+              <w:t>Test Generator Audio Frequency · Đơn vị: Hz · ≥ 300 · ≤ 3000</w:t>
+            </w:r>
+          </w:p>
+        </w:tc>
+        <w:tc>
+          <w:p>
+            <w:r>
+              <w:t>300</w:t>
+            </w:r>
+          </w:p>
+        </w:tc>
+        <w:tc>
+          <w:p>
+            <w:r>
+              <w:t>Giá trị: ______; Nguồn/trang: ______</w:t>
+            </w:r>
+          </w:p>
+        </w:tc>
+      </w:tr>
+      <w:tr>
+        <w:tc>
+          <w:p>
+            <w:r>
+              <w:t>Test Generator Ident Control · Chọn: Normal; No Ident; Continuous Ident</w:t>
+            </w:r>
+          </w:p>
+        </w:tc>
+        <w:tc>
+          <w:p>
+            <w:r>
+              <w:t>Normal</w:t>
+            </w:r>
+          </w:p>
+        </w:tc>
+        <w:tc>
+          <w:p>
+            <w:r>
+              <w:t>Giá trị: ______; Nguồn/trang: ______</w:t>
+            </w:r>
+          </w:p>
+        </w:tc>
+      </w:tr>
     </w:tbl>
     <w:p>
       <w:pPr>
@@ -3642,7 +4148,7 @@
         <w:tc>
           <w:p>
             <w:r>
-              <w:t>MON1 Tx power offset · Đơn vị: W · ≥ -200 · ≤ 200</w:t>
+              <w:t>MON1 Tx power offset · Đơn vị: % · ≥ -200 · ≤ 200</w:t>
             </w:r>
           </w:p>
         </w:tc>
@@ -3918,7 +4424,7 @@
         <w:tc>
           <w:p>
             <w:r>
-              <w:t>MON2 Tx power offset · Đơn vị: W · ≥ -200 · ≤ 200</w:t>
+              <w:t>MON2 Tx power offset · Đơn vị: % · ≥ -200 · ≤ 200</w:t>
             </w:r>
           </w:p>
         </w:tc>
@@ -3995,6 +4501,374 @@
           <w:p>
             <w:r>
               <w:t>0</w:t>
+            </w:r>
+          </w:p>
+        </w:tc>
+        <w:tc>
+          <w:p>
+            <w:r>
+              <w:t>Giá trị: ______; Nguồn/trang: ______</w:t>
+            </w:r>
+          </w:p>
+        </w:tc>
+      </w:tr>
+      <w:tr>
+        <w:tc>
+          <w:p>
+            <w:r>
+              <w:t>MON1 Tx power scale Standby · Đơn vị: % · ≥ 0 · ≤ 200</w:t>
+            </w:r>
+          </w:p>
+        </w:tc>
+        <w:tc>
+          <w:p>
+            <w:r>
+              <w:t>100</w:t>
+            </w:r>
+          </w:p>
+        </w:tc>
+        <w:tc>
+          <w:p>
+            <w:r>
+              <w:t>Giá trị: ______; Nguồn/trang: ______</w:t>
+            </w:r>
+          </w:p>
+        </w:tc>
+      </w:tr>
+      <w:tr>
+        <w:tc>
+          <w:p>
+            <w:r>
+              <w:t>MON1 Tx power offset Standby · Đơn vị: % · ≥ -200 · ≤ 200</w:t>
+            </w:r>
+          </w:p>
+        </w:tc>
+        <w:tc>
+          <w:p>
+            <w:r>
+              <w:t>0</w:t>
+            </w:r>
+          </w:p>
+        </w:tc>
+        <w:tc>
+          <w:p>
+            <w:r>
+              <w:t>Giá trị: ______; Nguồn/trang: ______</w:t>
+            </w:r>
+          </w:p>
+        </w:tc>
+      </w:tr>
+      <w:tr>
+        <w:tc>
+          <w:p>
+            <w:r>
+              <w:t>MON1 Tx frequency offset Standby · Đơn vị: ppm · ≥ -100 · ≤ 100</w:t>
+            </w:r>
+          </w:p>
+        </w:tc>
+        <w:tc>
+          <w:p>
+            <w:r>
+              <w:t>0</w:t>
+            </w:r>
+          </w:p>
+        </w:tc>
+        <w:tc>
+          <w:p>
+            <w:r>
+              <w:t>Giá trị: ______; Nguồn/trang: ______</w:t>
+            </w:r>
+          </w:p>
+        </w:tc>
+      </w:tr>
+      <w:tr>
+        <w:tc>
+          <w:p>
+            <w:r>
+              <w:t>MON2 Tx power scale Standby · Đơn vị: % · ≥ 0 · ≤ 200</w:t>
+            </w:r>
+          </w:p>
+        </w:tc>
+        <w:tc>
+          <w:p>
+            <w:r>
+              <w:t>100</w:t>
+            </w:r>
+          </w:p>
+        </w:tc>
+        <w:tc>
+          <w:p>
+            <w:r>
+              <w:t>Giá trị: ______; Nguồn/trang: ______</w:t>
+            </w:r>
+          </w:p>
+        </w:tc>
+      </w:tr>
+      <w:tr>
+        <w:tc>
+          <w:p>
+            <w:r>
+              <w:t>MON2 Tx power offset Standby · Đơn vị: % · ≥ -200 · ≤ 200</w:t>
+            </w:r>
+          </w:p>
+        </w:tc>
+        <w:tc>
+          <w:p>
+            <w:r>
+              <w:t>0</w:t>
+            </w:r>
+          </w:p>
+        </w:tc>
+        <w:tc>
+          <w:p>
+            <w:r>
+              <w:t>Giá trị: ______; Nguồn/trang: ______</w:t>
+            </w:r>
+          </w:p>
+        </w:tc>
+      </w:tr>
+      <w:tr>
+        <w:tc>
+          <w:p>
+            <w:r>
+              <w:t>MON2 Tx frequency offset Standby · Đơn vị: ppm · ≥ -100 · ≤ 100</w:t>
+            </w:r>
+          </w:p>
+        </w:tc>
+        <w:tc>
+          <w:p>
+            <w:r>
+              <w:t>0</w:t>
+            </w:r>
+          </w:p>
+        </w:tc>
+        <w:tc>
+          <w:p>
+            <w:r>
+              <w:t>Giá trị: ______; Nguồn/trang: ______</w:t>
+            </w:r>
+          </w:p>
+        </w:tc>
+      </w:tr>
+      <w:tr>
+        <w:tc>
+          <w:p>
+            <w:r>
+              <w:t>MON1 azimuth offset Test Generator / Certification · Đơn vị: ° · ≥ -360 · ≤ 360</w:t>
+            </w:r>
+          </w:p>
+        </w:tc>
+        <w:tc>
+          <w:p>
+            <w:r>
+              <w:t>0</w:t>
+            </w:r>
+          </w:p>
+        </w:tc>
+        <w:tc>
+          <w:p>
+            <w:r>
+              <w:t>Giá trị: ______; Nguồn/trang: ______</w:t>
+            </w:r>
+          </w:p>
+        </w:tc>
+      </w:tr>
+      <w:tr>
+        <w:tc>
+          <w:p>
+            <w:r>
+              <w:t>MON1 30 Hz scale Test Generator / Certification · Đơn vị: % · ≥ 0 · ≤ 200</w:t>
+            </w:r>
+          </w:p>
+        </w:tc>
+        <w:tc>
+          <w:p>
+            <w:r>
+              <w:t>100</w:t>
+            </w:r>
+          </w:p>
+        </w:tc>
+        <w:tc>
+          <w:p>
+            <w:r>
+              <w:t>Giá trị: ______; Nguồn/trang: ______</w:t>
+            </w:r>
+          </w:p>
+        </w:tc>
+      </w:tr>
+      <w:tr>
+        <w:tc>
+          <w:p>
+            <w:r>
+              <w:t>MON1 9960 Hz scale Test Generator / Certification · Đơn vị: % · ≥ 0 · ≤ 200</w:t>
+            </w:r>
+          </w:p>
+        </w:tc>
+        <w:tc>
+          <w:p>
+            <w:r>
+              <w:t>96.1</w:t>
+            </w:r>
+          </w:p>
+        </w:tc>
+        <w:tc>
+          <w:p>
+            <w:r>
+              <w:t>Giá trị: ______; Nguồn/trang: ______</w:t>
+            </w:r>
+          </w:p>
+        </w:tc>
+      </w:tr>
+      <w:tr>
+        <w:tc>
+          <w:p>
+            <w:r>
+              <w:t>MON1 deviation scale Test Generator / Certification · Đơn vị: % · ≥ 0 · ≤ 200</w:t>
+            </w:r>
+          </w:p>
+        </w:tc>
+        <w:tc>
+          <w:p>
+            <w:r>
+              <w:t>100</w:t>
+            </w:r>
+          </w:p>
+        </w:tc>
+        <w:tc>
+          <w:p>
+            <w:r>
+              <w:t>Giá trị: ______; Nguồn/trang: ______</w:t>
+            </w:r>
+          </w:p>
+        </w:tc>
+      </w:tr>
+      <w:tr>
+        <w:tc>
+          <w:p>
+            <w:r>
+              <w:t>MON1 ident scale Test Generator / Certification · Đơn vị: % · ≥ 0 · ≤ 200</w:t>
+            </w:r>
+          </w:p>
+        </w:tc>
+        <w:tc>
+          <w:p>
+            <w:r>
+              <w:t>100</w:t>
+            </w:r>
+          </w:p>
+        </w:tc>
+        <w:tc>
+          <w:p>
+            <w:r>
+              <w:t>Giá trị: ______; Nguồn/trang: ______</w:t>
+            </w:r>
+          </w:p>
+        </w:tc>
+      </w:tr>
+      <w:tr>
+        <w:tc>
+          <w:p>
+            <w:r>
+              <w:t>MON2 azimuth offset Test Generator / Certification · Đơn vị: ° · ≥ -360 · ≤ 360</w:t>
+            </w:r>
+          </w:p>
+        </w:tc>
+        <w:tc>
+          <w:p>
+            <w:r>
+              <w:t>0</w:t>
+            </w:r>
+          </w:p>
+        </w:tc>
+        <w:tc>
+          <w:p>
+            <w:r>
+              <w:t>Giá trị: ______; Nguồn/trang: ______</w:t>
+            </w:r>
+          </w:p>
+        </w:tc>
+      </w:tr>
+      <w:tr>
+        <w:tc>
+          <w:p>
+            <w:r>
+              <w:t>MON2 30 Hz scale Test Generator / Certification · Đơn vị: % · ≥ 0 · ≤ 200</w:t>
+            </w:r>
+          </w:p>
+        </w:tc>
+        <w:tc>
+          <w:p>
+            <w:r>
+              <w:t>100</w:t>
+            </w:r>
+          </w:p>
+        </w:tc>
+        <w:tc>
+          <w:p>
+            <w:r>
+              <w:t>Giá trị: ______; Nguồn/trang: ______</w:t>
+            </w:r>
+          </w:p>
+        </w:tc>
+      </w:tr>
+      <w:tr>
+        <w:tc>
+          <w:p>
+            <w:r>
+              <w:t>MON2 9960 Hz scale Test Generator / Certification · Đơn vị: % · ≥ 0 · ≤ 200</w:t>
+            </w:r>
+          </w:p>
+        </w:tc>
+        <w:tc>
+          <w:p>
+            <w:r>
+              <w:t>96.1</w:t>
+            </w:r>
+          </w:p>
+        </w:tc>
+        <w:tc>
+          <w:p>
+            <w:r>
+              <w:t>Giá trị: ______; Nguồn/trang: ______</w:t>
+            </w:r>
+          </w:p>
+        </w:tc>
+      </w:tr>
+      <w:tr>
+        <w:tc>
+          <w:p>
+            <w:r>
+              <w:t>MON2 deviation scale Test Generator / Certification · Đơn vị: % · ≥ 0 · ≤ 200</w:t>
+            </w:r>
+          </w:p>
+        </w:tc>
+        <w:tc>
+          <w:p>
+            <w:r>
+              <w:t>100</w:t>
+            </w:r>
+          </w:p>
+        </w:tc>
+        <w:tc>
+          <w:p>
+            <w:r>
+              <w:t>Giá trị: ______; Nguồn/trang: ______</w:t>
+            </w:r>
+          </w:p>
+        </w:tc>
+      </w:tr>
+      <w:tr>
+        <w:tc>
+          <w:p>
+            <w:r>
+              <w:t>MON2 ident scale Test Generator / Certification · Đơn vị: % · ≥ 0 · ≤ 200</w:t>
+            </w:r>
+          </w:p>
+        </w:tc>
+        <w:tc>
+          <w:p>
+            <w:r>
+              <w:t>100</w:t>
             </w:r>
           </w:p>
         </w:tc>

</xml_diff>